<commit_message>
switch to rmd because of tables
</commit_message>
<xml_diff>
--- a/manuscript/reference.docx
+++ b/manuscript/reference.docx
@@ -1,543 +1,847 @@
 
 <file path=word/document.xml><?xml version="1.0" encoding="utf-8"?>
-<w:document xmlns:o="urn:schemas-microsoft-com:office:office" xmlns:r="http://schemas.openxmlformats.org/officeDocument/2006/relationships" xmlns:v="urn:schemas-microsoft-com:vml" xmlns:w="http://schemas.openxmlformats.org/wordprocessingml/2006/main" xmlns:w10="urn:schemas-microsoft-com:office:word" xmlns:wp="http://schemas.openxmlformats.org/drawingml/2006/wordprocessingDrawing" xmlns:wps="http://schemas.microsoft.com/office/word/2010/wordprocessingShape" xmlns:wpg="http://schemas.microsoft.com/office/word/2010/wordprocessingGroup" xmlns:mc="http://schemas.openxmlformats.org/markup-compatibility/2006" xmlns:wp14="http://schemas.microsoft.com/office/word/2010/wordprocessingDrawing" xmlns:w14="http://schemas.microsoft.com/office/word/2010/wordml" xmlns:w15="http://schemas.microsoft.com/office/word/2012/wordml" mc:Ignorable="w14 wp14 w15">
+<w:document xmlns:wpc="http://schemas.microsoft.com/office/word/2010/wordprocessingCanvas" xmlns:cx="http://schemas.microsoft.com/office/drawing/2014/chartex" xmlns:cx1="http://schemas.microsoft.com/office/drawing/2015/9/8/chartex" xmlns:cx2="http://schemas.microsoft.com/office/drawing/2015/10/21/chartex" xmlns:cx3="http://schemas.microsoft.com/office/drawing/2016/5/9/chartex" xmlns:cx4="http://schemas.microsoft.com/office/drawing/2016/5/10/chartex" xmlns:cx5="http://schemas.microsoft.com/office/drawing/2016/5/11/chartex" xmlns:cx6="http://schemas.microsoft.com/office/drawing/2016/5/12/chartex" xmlns:cx7="http://schemas.microsoft.com/office/drawing/2016/5/13/chartex" xmlns:cx8="http://schemas.microsoft.com/office/drawing/2016/5/14/chartex" xmlns:mc="http://schemas.openxmlformats.org/markup-compatibility/2006" xmlns:aink="http://schemas.microsoft.com/office/drawing/2016/ink" xmlns:am3d="http://schemas.microsoft.com/office/drawing/2017/model3d" xmlns:o="urn:schemas-microsoft-com:office:office" xmlns:oel="http://schemas.microsoft.com/office/2019/extlst" xmlns:r="http://schemas.openxmlformats.org/officeDocument/2006/relationships" xmlns:m="http://schemas.openxmlformats.org/officeDocument/2006/math" xmlns:v="urn:schemas-microsoft-com:vml" xmlns:wp14="http://schemas.microsoft.com/office/word/2010/wordprocessingDrawing" xmlns:wp="http://schemas.openxmlformats.org/drawingml/2006/wordprocessingDrawing" xmlns:w10="urn:schemas-microsoft-com:office:word" xmlns:w="http://schemas.openxmlformats.org/wordprocessingml/2006/main" xmlns:w14="http://schemas.microsoft.com/office/word/2010/wordml" xmlns:w15="http://schemas.microsoft.com/office/word/2012/wordml" xmlns:w16cex="http://schemas.microsoft.com/office/word/2018/wordml/cex" xmlns:w16cid="http://schemas.microsoft.com/office/word/2016/wordml/cid" xmlns:w16="http://schemas.microsoft.com/office/word/2018/wordml" xmlns:w16du="http://schemas.microsoft.com/office/word/2023/wordml/word16du" xmlns:w16sdtdh="http://schemas.microsoft.com/office/word/2020/wordml/sdtdatahash" xmlns:w16sdtfl="http://schemas.microsoft.com/office/word/2024/wordml/sdtformatlock" xmlns:w16se="http://schemas.microsoft.com/office/word/2015/wordml/symex" xmlns:wpg="http://schemas.microsoft.com/office/word/2010/wordprocessingGroup" xmlns:wpi="http://schemas.microsoft.com/office/word/2010/wordprocessingInk" xmlns:wne="http://schemas.microsoft.com/office/word/2006/wordml" xmlns:wps="http://schemas.microsoft.com/office/word/2010/wordprocessingShape" mc:Ignorable="w14 w15 w16se w16cid w16 w16cex w16sdtdh w16sdtfl w16du wp14">
   <w:body>
     <w:p>
       <w:pPr>
         <w:pStyle w:val="FirstParagraph"/>
-        <w:spacing w:lineRule="auto" w:line="480" w:before="180" w:after="180"/>
-        <w:contextualSpacing/>
-        <w:rPr/>
+        <w:spacing w:before="180" w:after="180"/>
       </w:pPr>
       <w:r>
-        <w:rPr/>
         <w:t>hello word</w:t>
       </w:r>
     </w:p>
     <w:sectPr>
-      <w:type w:val="nextPage"/>
       <w:pgSz w:w="12240" w:h="15840"/>
-      <w:pgMar w:left="1800" w:right="1800" w:gutter="0" w:header="0" w:top="1440" w:footer="0" w:bottom="1440"/>
-      <w:lnNumType w:countBy="1" w:restart="continuous" w:distance="288"/>
-      <w:pgNumType w:fmt="decimal"/>
-      <w:formProt w:val="false"/>
-      <w:textDirection w:val="lrTb"/>
-      <w:docGrid w:type="default" w:linePitch="100" w:charSpace="0"/>
+      <w:pgMar w:top="1440" w:right="1800" w:bottom="1440" w:left="1800" w:header="0" w:footer="0" w:gutter="0"/>
+      <w:lnNumType w:countBy="1" w:distance="288" w:restart="continuous"/>
+      <w:cols w:space="720"/>
+      <w:formProt w:val="0"/>
+      <w:docGrid w:linePitch="100"/>
     </w:sectPr>
   </w:body>
 </w:document>
 </file>
 
 <file path=word/styles.xml><?xml version="1.0" encoding="utf-8"?>
-<w:styles xmlns:w="http://schemas.openxmlformats.org/wordprocessingml/2006/main" xmlns:w14="http://schemas.microsoft.com/office/word/2010/wordml" xmlns:mc="http://schemas.openxmlformats.org/markup-compatibility/2006" mc:Ignorable="w14">
+<w:styles xmlns:mc="http://schemas.openxmlformats.org/markup-compatibility/2006" xmlns:r="http://schemas.openxmlformats.org/officeDocument/2006/relationships" xmlns:w="http://schemas.openxmlformats.org/wordprocessingml/2006/main" xmlns:w14="http://schemas.microsoft.com/office/word/2010/wordml" xmlns:w15="http://schemas.microsoft.com/office/word/2012/wordml" xmlns:w16cex="http://schemas.microsoft.com/office/word/2018/wordml/cex" xmlns:w16cid="http://schemas.microsoft.com/office/word/2016/wordml/cid" xmlns:w16="http://schemas.microsoft.com/office/word/2018/wordml" xmlns:w16du="http://schemas.microsoft.com/office/word/2023/wordml/word16du" xmlns:w16sdtdh="http://schemas.microsoft.com/office/word/2020/wordml/sdtdatahash" xmlns:w16sdtfl="http://schemas.microsoft.com/office/word/2024/wordml/sdtformatlock" xmlns:w16se="http://schemas.microsoft.com/office/word/2015/wordml/symex" mc:Ignorable="w14 w15 w16se w16cid w16 w16cex w16sdtdh w16sdtfl w16du">
   <w:docDefaults>
     <w:rPrDefault>
       <w:rPr>
-        <w:rFonts w:ascii="Cambria" w:hAnsi="Cambria" w:eastAsia="Cambria" w:cs="" w:asciiTheme="minorHAnsi" w:cstheme="minorBidi" w:eastAsiaTheme="minorHAnsi" w:hAnsiTheme="minorHAnsi"/>
+        <w:rFonts w:asciiTheme="minorHAnsi" w:eastAsiaTheme="minorHAnsi" w:hAnsiTheme="minorHAnsi" w:cstheme="minorBidi"/>
         <w:szCs w:val="24"/>
         <w:lang w:val="en-US" w:eastAsia="en-US" w:bidi="ar-SA"/>
       </w:rPr>
     </w:rPrDefault>
     <w:pPrDefault>
       <w:pPr>
-        <w:suppressAutoHyphens w:val="true"/>
+        <w:suppressAutoHyphens/>
       </w:pPr>
     </w:pPrDefault>
   </w:docDefaults>
-  <w:latentStyles w:defLockedState="0" w:defUIPriority="0" w:defSemiHidden="0" w:defUnhideWhenUsed="0" w:defQFormat="0" w:count="276"/>
-  <w:style w:type="paragraph" w:styleId="Normal" w:default="1">
+  <w:latentStyles w:defLockedState="0" w:defUIPriority="0" w:defSemiHidden="0" w:defUnhideWhenUsed="0" w:defQFormat="0" w:count="376">
+    <w:lsdException w:name="Normal Table" w:semiHidden="1" w:unhideWhenUsed="1"/>
+    <w:lsdException w:name="Table Simple 1" w:semiHidden="1" w:unhideWhenUsed="1"/>
+    <w:lsdException w:name="Table Simple 2" w:semiHidden="1" w:unhideWhenUsed="1"/>
+    <w:lsdException w:name="Table Simple 3" w:semiHidden="1" w:unhideWhenUsed="1"/>
+    <w:lsdException w:name="Table Classic 1" w:semiHidden="1" w:unhideWhenUsed="1"/>
+    <w:lsdException w:name="Table Classic 2" w:semiHidden="1" w:unhideWhenUsed="1"/>
+    <w:lsdException w:name="Table Classic 3" w:semiHidden="1" w:unhideWhenUsed="1"/>
+    <w:lsdException w:name="Table Classic 4" w:semiHidden="1" w:unhideWhenUsed="1"/>
+    <w:lsdException w:name="Table Colorful 1" w:semiHidden="1" w:unhideWhenUsed="1"/>
+    <w:lsdException w:name="Table Colorful 2" w:semiHidden="1" w:unhideWhenUsed="1"/>
+    <w:lsdException w:name="Table Colorful 3" w:semiHidden="1" w:unhideWhenUsed="1"/>
+    <w:lsdException w:name="Table Columns 1" w:semiHidden="1" w:unhideWhenUsed="1"/>
+    <w:lsdException w:name="Table Columns 2" w:semiHidden="1" w:unhideWhenUsed="1"/>
+    <w:lsdException w:name="Table Columns 3" w:semiHidden="1" w:unhideWhenUsed="1"/>
+    <w:lsdException w:name="Table Columns 4" w:semiHidden="1" w:unhideWhenUsed="1"/>
+    <w:lsdException w:name="Table Columns 5" w:semiHidden="1" w:unhideWhenUsed="1"/>
+    <w:lsdException w:name="Table Grid 1" w:semiHidden="1" w:unhideWhenUsed="1"/>
+    <w:lsdException w:name="Table Grid 2" w:semiHidden="1" w:unhideWhenUsed="1"/>
+    <w:lsdException w:name="Table Grid 3" w:semiHidden="1" w:unhideWhenUsed="1"/>
+    <w:lsdException w:name="Table Grid 4" w:semiHidden="1" w:unhideWhenUsed="1"/>
+    <w:lsdException w:name="Table Grid 5" w:semiHidden="1" w:unhideWhenUsed="1"/>
+    <w:lsdException w:name="Table Grid 6" w:semiHidden="1" w:unhideWhenUsed="1"/>
+    <w:lsdException w:name="Table Grid 7" w:semiHidden="1" w:unhideWhenUsed="1"/>
+    <w:lsdException w:name="Table Grid 8" w:semiHidden="1" w:unhideWhenUsed="1"/>
+    <w:lsdException w:name="Table List 1" w:semiHidden="1" w:unhideWhenUsed="1"/>
+    <w:lsdException w:name="Table List 2" w:semiHidden="1" w:unhideWhenUsed="1"/>
+    <w:lsdException w:name="Table List 3" w:semiHidden="1" w:unhideWhenUsed="1"/>
+    <w:lsdException w:name="Table List 4" w:semiHidden="1" w:unhideWhenUsed="1"/>
+    <w:lsdException w:name="Table List 5" w:semiHidden="1" w:unhideWhenUsed="1"/>
+    <w:lsdException w:name="Table List 6" w:semiHidden="1" w:unhideWhenUsed="1"/>
+    <w:lsdException w:name="Table List 7" w:semiHidden="1" w:unhideWhenUsed="1"/>
+    <w:lsdException w:name="Table List 8" w:semiHidden="1" w:unhideWhenUsed="1"/>
+    <w:lsdException w:name="Table 3D effects 1" w:semiHidden="1" w:unhideWhenUsed="1"/>
+    <w:lsdException w:name="Table 3D effects 2" w:semiHidden="1" w:unhideWhenUsed="1"/>
+    <w:lsdException w:name="Table 3D effects 3" w:semiHidden="1" w:unhideWhenUsed="1"/>
+    <w:lsdException w:name="Table Contemporary" w:semiHidden="1" w:unhideWhenUsed="1"/>
+    <w:lsdException w:name="Table Elegant" w:semiHidden="1" w:unhideWhenUsed="1"/>
+    <w:lsdException w:name="Table Professional" w:semiHidden="1" w:unhideWhenUsed="1"/>
+    <w:lsdException w:name="Table Subtle 1" w:semiHidden="1" w:unhideWhenUsed="1"/>
+    <w:lsdException w:name="Table Subtle 2" w:semiHidden="1" w:unhideWhenUsed="1"/>
+    <w:lsdException w:name="Table Web 1" w:semiHidden="1" w:unhideWhenUsed="1"/>
+    <w:lsdException w:name="Table Web 2" w:semiHidden="1" w:unhideWhenUsed="1"/>
+    <w:lsdException w:name="Table Web 3" w:semiHidden="1" w:unhideWhenUsed="1"/>
+    <w:lsdException w:name="Table Theme" w:semiHidden="1" w:unhideWhenUsed="1"/>
+    <w:lsdException w:name="Light Shading"/>
+    <w:lsdException w:name="Light List"/>
+    <w:lsdException w:name="Light Grid"/>
+    <w:lsdException w:name="Medium Shading 1"/>
+    <w:lsdException w:name="Medium Shading 2"/>
+    <w:lsdException w:name="Medium List 1"/>
+    <w:lsdException w:name="Medium List 2"/>
+    <w:lsdException w:name="Medium Grid 1"/>
+    <w:lsdException w:name="Medium Grid 2"/>
+    <w:lsdException w:name="Medium Grid 3"/>
+    <w:lsdException w:name="Dark List"/>
+    <w:lsdException w:name="Colorful Shading"/>
+    <w:lsdException w:name="Colorful List"/>
+    <w:lsdException w:name="Colorful Grid"/>
+    <w:lsdException w:name="Light Shading Accent 1"/>
+    <w:lsdException w:name="Light List Accent 1"/>
+    <w:lsdException w:name="Light Grid Accent 1"/>
+    <w:lsdException w:name="Medium Shading 1 Accent 1"/>
+    <w:lsdException w:name="Medium Shading 2 Accent 1"/>
+    <w:lsdException w:name="Medium List 1 Accent 1"/>
+    <w:lsdException w:name="Medium List 2 Accent 1"/>
+    <w:lsdException w:name="Medium Grid 1 Accent 1"/>
+    <w:lsdException w:name="Medium Grid 2 Accent 1"/>
+    <w:lsdException w:name="Medium Grid 3 Accent 1"/>
+    <w:lsdException w:name="Dark List Accent 1"/>
+    <w:lsdException w:name="Colorful Shading Accent 1"/>
+    <w:lsdException w:name="Colorful List Accent 1"/>
+    <w:lsdException w:name="Colorful Grid Accent 1"/>
+    <w:lsdException w:name="Light Shading Accent 2"/>
+    <w:lsdException w:name="Light List Accent 2"/>
+    <w:lsdException w:name="Light Grid Accent 2"/>
+    <w:lsdException w:name="Medium Shading 1 Accent 2"/>
+    <w:lsdException w:name="Medium Shading 2 Accent 2"/>
+    <w:lsdException w:name="Medium List 1 Accent 2"/>
+    <w:lsdException w:name="Medium List 2 Accent 2"/>
+    <w:lsdException w:name="Medium Grid 1 Accent 2"/>
+    <w:lsdException w:name="Medium Grid 2 Accent 2"/>
+    <w:lsdException w:name="Medium Grid 3 Accent 2"/>
+    <w:lsdException w:name="Dark List Accent 2"/>
+    <w:lsdException w:name="Colorful Shading Accent 2"/>
+    <w:lsdException w:name="Colorful List Accent 2"/>
+    <w:lsdException w:name="Colorful Grid Accent 2"/>
+    <w:lsdException w:name="Light Shading Accent 3"/>
+    <w:lsdException w:name="Light List Accent 3"/>
+    <w:lsdException w:name="Light Grid Accent 3"/>
+    <w:lsdException w:name="Medium Shading 1 Accent 3"/>
+    <w:lsdException w:name="Medium Shading 2 Accent 3"/>
+    <w:lsdException w:name="Medium List 1 Accent 3"/>
+    <w:lsdException w:name="Medium List 2 Accent 3"/>
+    <w:lsdException w:name="Medium Grid 1 Accent 3"/>
+    <w:lsdException w:name="Medium Grid 2 Accent 3"/>
+    <w:lsdException w:name="Medium Grid 3 Accent 3"/>
+    <w:lsdException w:name="Dark List Accent 3"/>
+    <w:lsdException w:name="Colorful Shading Accent 3"/>
+    <w:lsdException w:name="Colorful List Accent 3"/>
+    <w:lsdException w:name="Colorful Grid Accent 3"/>
+    <w:lsdException w:name="Light Shading Accent 4"/>
+    <w:lsdException w:name="Light List Accent 4"/>
+    <w:lsdException w:name="Light Grid Accent 4"/>
+    <w:lsdException w:name="Medium Shading 1 Accent 4"/>
+    <w:lsdException w:name="Medium Shading 2 Accent 4"/>
+    <w:lsdException w:name="Medium List 1 Accent 4"/>
+    <w:lsdException w:name="Medium List 2 Accent 4"/>
+    <w:lsdException w:name="Medium Grid 1 Accent 4"/>
+    <w:lsdException w:name="Medium Grid 2 Accent 4"/>
+    <w:lsdException w:name="Medium Grid 3 Accent 4"/>
+    <w:lsdException w:name="Dark List Accent 4"/>
+    <w:lsdException w:name="Colorful Shading Accent 4"/>
+    <w:lsdException w:name="Colorful List Accent 4"/>
+    <w:lsdException w:name="Colorful Grid Accent 4"/>
+    <w:lsdException w:name="Light Shading Accent 5"/>
+    <w:lsdException w:name="Light List Accent 5"/>
+    <w:lsdException w:name="Light Grid Accent 5"/>
+    <w:lsdException w:name="Medium Shading 1 Accent 5"/>
+    <w:lsdException w:name="Medium Shading 2 Accent 5"/>
+    <w:lsdException w:name="Medium List 1 Accent 5"/>
+    <w:lsdException w:name="Medium List 2 Accent 5"/>
+    <w:lsdException w:name="Medium Grid 1 Accent 5"/>
+    <w:lsdException w:name="Medium Grid 2 Accent 5"/>
+    <w:lsdException w:name="Medium Grid 3 Accent 5"/>
+    <w:lsdException w:name="Dark List Accent 5"/>
+    <w:lsdException w:name="Colorful Shading Accent 5"/>
+    <w:lsdException w:name="Colorful List Accent 5"/>
+    <w:lsdException w:name="Colorful Grid Accent 5"/>
+    <w:lsdException w:name="Light Shading Accent 6"/>
+    <w:lsdException w:name="Light List Accent 6"/>
+    <w:lsdException w:name="Light Grid Accent 6"/>
+    <w:lsdException w:name="Medium Shading 1 Accent 6"/>
+    <w:lsdException w:name="Medium Shading 2 Accent 6"/>
+    <w:lsdException w:name="Medium List 1 Accent 6"/>
+    <w:lsdException w:name="Medium List 2 Accent 6"/>
+    <w:lsdException w:name="Medium Grid 1 Accent 6"/>
+    <w:lsdException w:name="Medium Grid 2 Accent 6"/>
+    <w:lsdException w:name="Medium Grid 3 Accent 6"/>
+    <w:lsdException w:name="Dark List Accent 6"/>
+    <w:lsdException w:name="Colorful Shading Accent 6"/>
+    <w:lsdException w:name="Colorful List Accent 6"/>
+    <w:lsdException w:name="Colorful Grid Accent 6"/>
+    <w:lsdException w:name="Grid Table 4" w:uiPriority="49"/>
+    <w:lsdException w:name="Grid Table 5 Dark" w:uiPriority="50"/>
+    <w:lsdException w:name="Grid Table 6 Colorful" w:uiPriority="51"/>
+    <w:lsdException w:name="Grid Table 7 Colorful" w:uiPriority="52"/>
+    <w:lsdException w:name="Grid Table 1 Light Accent 1" w:uiPriority="46"/>
+    <w:lsdException w:name="Grid Table 2 Accent 1" w:uiPriority="47"/>
+    <w:lsdException w:name="Grid Table 3 Accent 1" w:uiPriority="48"/>
+    <w:lsdException w:name="Grid Table 4 Accent 1" w:uiPriority="49"/>
+    <w:lsdException w:name="Grid Table 5 Dark Accent 1" w:uiPriority="50"/>
+    <w:lsdException w:name="Grid Table 6 Colorful Accent 1" w:uiPriority="51"/>
+    <w:lsdException w:name="Grid Table 7 Colorful Accent 1" w:uiPriority="52"/>
+    <w:lsdException w:name="Grid Table 1 Light Accent 2" w:uiPriority="46"/>
+    <w:lsdException w:name="Grid Table 2 Accent 2" w:uiPriority="47"/>
+    <w:lsdException w:name="Grid Table 3 Accent 2" w:uiPriority="48"/>
+    <w:lsdException w:name="Grid Table 4 Accent 2" w:uiPriority="49"/>
+    <w:lsdException w:name="Grid Table 5 Dark Accent 2" w:uiPriority="50"/>
+    <w:lsdException w:name="Grid Table 6 Colorful Accent 2" w:uiPriority="51"/>
+    <w:lsdException w:name="Grid Table 7 Colorful Accent 2" w:uiPriority="52"/>
+    <w:lsdException w:name="Grid Table 1 Light Accent 3" w:uiPriority="46"/>
+    <w:lsdException w:name="Grid Table 2 Accent 3" w:uiPriority="47"/>
+    <w:lsdException w:name="Grid Table 3 Accent 3" w:uiPriority="48"/>
+    <w:lsdException w:name="Grid Table 4 Accent 3" w:uiPriority="49"/>
+    <w:lsdException w:name="Grid Table 5 Dark Accent 3" w:uiPriority="50"/>
+    <w:lsdException w:name="Grid Table 6 Colorful Accent 3" w:uiPriority="51"/>
+    <w:lsdException w:name="Grid Table 7 Colorful Accent 3" w:uiPriority="52"/>
+    <w:lsdException w:name="Grid Table 1 Light Accent 4" w:uiPriority="46"/>
+    <w:lsdException w:name="Grid Table 2 Accent 4" w:uiPriority="47"/>
+    <w:lsdException w:name="Grid Table 3 Accent 4" w:uiPriority="48"/>
+    <w:lsdException w:name="Grid Table 4 Accent 4" w:uiPriority="49"/>
+    <w:lsdException w:name="Grid Table 5 Dark Accent 4" w:uiPriority="50"/>
+    <w:lsdException w:name="Grid Table 6 Colorful Accent 4" w:uiPriority="51"/>
+    <w:lsdException w:name="Grid Table 7 Colorful Accent 4" w:uiPriority="52"/>
+    <w:lsdException w:name="Grid Table 1 Light Accent 5" w:uiPriority="46"/>
+    <w:lsdException w:name="Grid Table 2 Accent 5" w:uiPriority="47"/>
+    <w:lsdException w:name="Grid Table 3 Accent 5" w:uiPriority="48"/>
+    <w:lsdException w:name="Grid Table 4 Accent 5" w:uiPriority="49"/>
+    <w:lsdException w:name="Grid Table 5 Dark Accent 5" w:uiPriority="50"/>
+    <w:lsdException w:name="Grid Table 6 Colorful Accent 5" w:uiPriority="51"/>
+    <w:lsdException w:name="Grid Table 7 Colorful Accent 5" w:uiPriority="52"/>
+    <w:lsdException w:name="Grid Table 1 Light Accent 6" w:uiPriority="46"/>
+    <w:lsdException w:name="Grid Table 2 Accent 6" w:uiPriority="47"/>
+    <w:lsdException w:name="Grid Table 3 Accent 6" w:uiPriority="48"/>
+    <w:lsdException w:name="Grid Table 4 Accent 6" w:uiPriority="49"/>
+    <w:lsdException w:name="Grid Table 5 Dark Accent 6" w:uiPriority="50"/>
+    <w:lsdException w:name="Grid Table 6 Colorful Accent 6" w:uiPriority="51"/>
+    <w:lsdException w:name="Grid Table 7 Colorful Accent 6" w:uiPriority="52"/>
+    <w:lsdException w:name="List Table 1 Light" w:uiPriority="46"/>
+    <w:lsdException w:name="List Table 2" w:uiPriority="47"/>
+    <w:lsdException w:name="List Table 3" w:uiPriority="48"/>
+    <w:lsdException w:name="List Table 4" w:uiPriority="49"/>
+    <w:lsdException w:name="List Table 5 Dark" w:uiPriority="50"/>
+    <w:lsdException w:name="List Table 6 Colorful" w:uiPriority="51"/>
+    <w:lsdException w:name="List Table 7 Colorful" w:uiPriority="52"/>
+    <w:lsdException w:name="List Table 1 Light Accent 1" w:uiPriority="46"/>
+    <w:lsdException w:name="List Table 2 Accent 1" w:uiPriority="47"/>
+    <w:lsdException w:name="List Table 3 Accent 1" w:uiPriority="48"/>
+    <w:lsdException w:name="List Table 4 Accent 1" w:uiPriority="49"/>
+    <w:lsdException w:name="List Table 5 Dark Accent 1" w:uiPriority="50"/>
+    <w:lsdException w:name="List Table 6 Colorful Accent 1" w:uiPriority="51"/>
+    <w:lsdException w:name="List Table 7 Colorful Accent 1" w:uiPriority="52"/>
+    <w:lsdException w:name="List Table 1 Light Accent 2" w:uiPriority="46"/>
+    <w:lsdException w:name="List Table 2 Accent 2" w:uiPriority="47"/>
+    <w:lsdException w:name="List Table 3 Accent 2" w:uiPriority="48"/>
+    <w:lsdException w:name="List Table 4 Accent 2" w:uiPriority="49"/>
+    <w:lsdException w:name="List Table 5 Dark Accent 2" w:uiPriority="50"/>
+    <w:lsdException w:name="List Table 6 Colorful Accent 2" w:uiPriority="51"/>
+    <w:lsdException w:name="List Table 7 Colorful Accent 2" w:uiPriority="52"/>
+    <w:lsdException w:name="List Table 1 Light Accent 3" w:uiPriority="46"/>
+    <w:lsdException w:name="List Table 2 Accent 3" w:uiPriority="47"/>
+    <w:lsdException w:name="List Table 3 Accent 3" w:uiPriority="48"/>
+    <w:lsdException w:name="List Table 4 Accent 3" w:uiPriority="49"/>
+    <w:lsdException w:name="List Table 5 Dark Accent 3" w:uiPriority="50"/>
+    <w:lsdException w:name="List Table 6 Colorful Accent 3" w:uiPriority="51"/>
+    <w:lsdException w:name="List Table 7 Colorful Accent 3" w:uiPriority="52"/>
+    <w:lsdException w:name="List Table 1 Light Accent 4" w:uiPriority="46"/>
+    <w:lsdException w:name="List Table 2 Accent 4" w:uiPriority="47"/>
+    <w:lsdException w:name="List Table 3 Accent 4" w:uiPriority="48"/>
+    <w:lsdException w:name="List Table 4 Accent 4" w:uiPriority="49"/>
+    <w:lsdException w:name="List Table 5 Dark Accent 4" w:uiPriority="50"/>
+    <w:lsdException w:name="List Table 6 Colorful Accent 4" w:uiPriority="51"/>
+    <w:lsdException w:name="List Table 7 Colorful Accent 4" w:uiPriority="52"/>
+    <w:lsdException w:name="List Table 1 Light Accent 5" w:uiPriority="46"/>
+    <w:lsdException w:name="List Table 2 Accent 5" w:uiPriority="47"/>
+    <w:lsdException w:name="List Table 3 Accent 5" w:uiPriority="48"/>
+    <w:lsdException w:name="List Table 4 Accent 5" w:uiPriority="49"/>
+    <w:lsdException w:name="List Table 5 Dark Accent 5" w:uiPriority="50"/>
+    <w:lsdException w:name="List Table 6 Colorful Accent 5" w:uiPriority="51"/>
+    <w:lsdException w:name="List Table 7 Colorful Accent 5" w:uiPriority="52"/>
+    <w:lsdException w:name="List Table 1 Light Accent 6" w:uiPriority="46"/>
+    <w:lsdException w:name="List Table 2 Accent 6" w:uiPriority="47"/>
+    <w:lsdException w:name="List Table 3 Accent 6" w:uiPriority="48"/>
+    <w:lsdException w:name="List Table 4 Accent 6" w:uiPriority="49"/>
+    <w:lsdException w:name="List Table 5 Dark Accent 6" w:uiPriority="50"/>
+    <w:lsdException w:name="List Table 6 Colorful Accent 6" w:uiPriority="51"/>
+    <w:lsdException w:name="List Table 7 Colorful Accent 6" w:uiPriority="52"/>
+    <w:lsdException w:name="Mention" w:semiHidden="1" w:uiPriority="99" w:unhideWhenUsed="1"/>
+    <w:lsdException w:name="Smart Hyperlink" w:semiHidden="1" w:uiPriority="99" w:unhideWhenUsed="1"/>
+    <w:lsdException w:name="Hashtag" w:semiHidden="1" w:uiPriority="99" w:unhideWhenUsed="1"/>
+    <w:lsdException w:name="Unresolved Mention" w:semiHidden="1" w:uiPriority="99" w:unhideWhenUsed="1"/>
+    <w:lsdException w:name="Smart Link" w:semiHidden="1" w:uiPriority="99" w:unhideWhenUsed="1"/>
+  </w:latentStyles>
+  <w:style w:type="paragraph" w:default="1" w:styleId="Normal">
     <w:name w:val="Normal"/>
     <w:qFormat/>
     <w:pPr>
-      <w:widowControl/>
-      <w:suppressAutoHyphens w:val="true"/>
-      <w:bidi w:val="0"/>
-      <w:spacing w:lineRule="auto" w:line="480" w:before="0" w:after="200"/>
-      <w:jc w:val="left"/>
-    </w:pPr>
-    <w:rPr>
-      <w:rFonts w:ascii="Times" w:hAnsi="Times" w:eastAsia="Cambria" w:cs="" w:cstheme="minorBidi" w:eastAsiaTheme="minorHAnsi"/>
-      <w:color w:val="auto"/>
-      <w:kern w:val="0"/>
+      <w:spacing w:after="200" w:line="480" w:lineRule="auto"/>
+    </w:pPr>
+    <w:rPr>
+      <w:rFonts w:ascii="Times" w:hAnsi="Times"/>
       <w:sz w:val="24"/>
-      <w:szCs w:val="24"/>
-      <w:lang w:val="en-US" w:eastAsia="en-US" w:bidi="ar-SA"/>
     </w:rPr>
   </w:style>
   <w:style w:type="paragraph" w:styleId="Heading1">
-    <w:name w:val="Heading 1"/>
+    <w:name w:val="heading 1"/>
     <w:basedOn w:val="Normal"/>
     <w:uiPriority w:val="9"/>
     <w:qFormat/>
     <w:pPr>
-      <w:keepNext w:val="true"/>
+      <w:keepNext/>
       <w:keepLines/>
       <w:spacing w:before="480" w:after="0"/>
-    </w:pPr>
-    <w:rPr>
-      <w:rFonts w:ascii="Times" w:hAnsi="Times" w:eastAsia="" w:cs="" w:cstheme="majorBidi" w:eastAsiaTheme="majorEastAsia"/>
+      <w:outlineLvl w:val="0"/>
+    </w:pPr>
+    <w:rPr>
+      <w:rFonts w:eastAsiaTheme="majorEastAsia" w:cstheme="majorBidi"/>
       <w:b/>
       <w:bCs/>
-      <w:color w:val="auto" w:themeShade="b5"/>
       <w:sz w:val="32"/>
       <w:szCs w:val="32"/>
     </w:rPr>
   </w:style>
   <w:style w:type="paragraph" w:styleId="Heading2">
-    <w:name w:val="Heading 2"/>
+    <w:name w:val="heading 2"/>
     <w:basedOn w:val="Normal"/>
     <w:uiPriority w:val="9"/>
     <w:unhideWhenUsed/>
     <w:qFormat/>
     <w:pPr>
-      <w:keepNext w:val="true"/>
+      <w:keepNext/>
       <w:keepLines/>
       <w:spacing w:before="200" w:after="0"/>
-    </w:pPr>
-    <w:rPr>
-      <w:rFonts w:ascii="Times" w:hAnsi="Times" w:eastAsia="" w:cs="" w:cstheme="majorBidi" w:eastAsiaTheme="majorEastAsia"/>
-      <w:b w:val="false"/>
+      <w:outlineLvl w:val="1"/>
+    </w:pPr>
+    <w:rPr>
+      <w:rFonts w:eastAsiaTheme="majorEastAsia" w:cstheme="majorBidi"/>
       <w:bCs/>
-      <w:color w:val="auto"/>
       <w:sz w:val="32"/>
       <w:szCs w:val="32"/>
     </w:rPr>
   </w:style>
   <w:style w:type="paragraph" w:styleId="Heading3">
-    <w:name w:val="Heading 3"/>
+    <w:name w:val="heading 3"/>
     <w:basedOn w:val="Normal"/>
     <w:uiPriority w:val="9"/>
     <w:unhideWhenUsed/>
     <w:qFormat/>
     <w:pPr>
-      <w:keepNext w:val="true"/>
+      <w:keepNext/>
       <w:keepLines/>
       <w:spacing w:before="200" w:after="0"/>
-    </w:pPr>
-    <w:rPr>
-      <w:rFonts w:ascii="Times" w:hAnsi="Times" w:eastAsia="" w:cs="" w:cstheme="majorBidi" w:eastAsiaTheme="majorEastAsia"/>
+      <w:outlineLvl w:val="2"/>
+    </w:pPr>
+    <w:rPr>
+      <w:rFonts w:eastAsiaTheme="majorEastAsia" w:cstheme="majorBidi"/>
       <w:b/>
       <w:bCs/>
-      <w:color w:val="auto"/>
       <w:sz w:val="28"/>
       <w:szCs w:val="28"/>
     </w:rPr>
   </w:style>
   <w:style w:type="paragraph" w:styleId="Heading4">
-    <w:name w:val="Heading 4"/>
+    <w:name w:val="heading 4"/>
     <w:basedOn w:val="Normal"/>
     <w:uiPriority w:val="9"/>
     <w:unhideWhenUsed/>
     <w:qFormat/>
     <w:pPr>
-      <w:keepNext w:val="true"/>
+      <w:keepNext/>
       <w:keepLines/>
       <w:spacing w:before="200" w:after="0"/>
       <w:outlineLvl w:val="3"/>
     </w:pPr>
     <w:rPr>
-      <w:rFonts w:ascii="Calibri" w:hAnsi="Calibri" w:eastAsia="" w:cs="" w:asciiTheme="majorHAnsi" w:cstheme="majorBidi" w:eastAsiaTheme="majorEastAsia" w:hAnsiTheme="majorHAnsi"/>
+      <w:rFonts w:asciiTheme="majorHAnsi" w:eastAsiaTheme="majorEastAsia" w:hAnsiTheme="majorHAnsi" w:cstheme="majorBidi"/>
       <w:b/>
       <w:bCs/>
       <w:color w:val="4F81BD" w:themeColor="accent1"/>
-      <w:sz w:val="24"/>
-      <w:szCs w:val="24"/>
     </w:rPr>
   </w:style>
   <w:style w:type="paragraph" w:styleId="Heading5">
-    <w:name w:val="Heading 5"/>
+    <w:name w:val="heading 5"/>
     <w:basedOn w:val="Normal"/>
     <w:uiPriority w:val="9"/>
     <w:unhideWhenUsed/>
     <w:qFormat/>
     <w:pPr>
-      <w:keepNext w:val="true"/>
+      <w:keepNext/>
       <w:keepLines/>
       <w:spacing w:before="200" w:after="0"/>
       <w:outlineLvl w:val="4"/>
     </w:pPr>
     <w:rPr>
-      <w:rFonts w:ascii="Calibri" w:hAnsi="Calibri" w:eastAsia="" w:cs="" w:asciiTheme="majorHAnsi" w:cstheme="majorBidi" w:eastAsiaTheme="majorEastAsia" w:hAnsiTheme="majorHAnsi"/>
+      <w:rFonts w:asciiTheme="majorHAnsi" w:eastAsiaTheme="majorEastAsia" w:hAnsiTheme="majorHAnsi" w:cstheme="majorBidi"/>
       <w:i/>
       <w:iCs/>
       <w:color w:val="4F81BD" w:themeColor="accent1"/>
-      <w:sz w:val="24"/>
-      <w:szCs w:val="24"/>
     </w:rPr>
   </w:style>
   <w:style w:type="paragraph" w:styleId="Heading6">
-    <w:name w:val="Heading 6"/>
+    <w:name w:val="heading 6"/>
     <w:basedOn w:val="Normal"/>
     <w:uiPriority w:val="9"/>
     <w:unhideWhenUsed/>
     <w:qFormat/>
     <w:pPr>
-      <w:keepNext w:val="true"/>
+      <w:keepNext/>
       <w:keepLines/>
       <w:spacing w:before="200" w:after="0"/>
       <w:outlineLvl w:val="5"/>
     </w:pPr>
     <w:rPr>
-      <w:rFonts w:ascii="Calibri" w:hAnsi="Calibri" w:eastAsia="" w:cs="" w:asciiTheme="majorHAnsi" w:cstheme="majorBidi" w:eastAsiaTheme="majorEastAsia" w:hAnsiTheme="majorHAnsi"/>
+      <w:rFonts w:asciiTheme="majorHAnsi" w:eastAsiaTheme="majorEastAsia" w:hAnsiTheme="majorHAnsi" w:cstheme="majorBidi"/>
       <w:color w:val="4F81BD" w:themeColor="accent1"/>
-      <w:sz w:val="24"/>
-      <w:szCs w:val="24"/>
     </w:rPr>
   </w:style>
   <w:style w:type="paragraph" w:styleId="Heading7">
-    <w:name w:val="Heading 7"/>
+    <w:name w:val="heading 7"/>
     <w:basedOn w:val="Normal"/>
     <w:uiPriority w:val="9"/>
     <w:unhideWhenUsed/>
     <w:qFormat/>
     <w:pPr>
-      <w:keepNext w:val="true"/>
+      <w:keepNext/>
       <w:keepLines/>
       <w:spacing w:before="200" w:after="0"/>
       <w:outlineLvl w:val="6"/>
     </w:pPr>
     <w:rPr>
-      <w:rFonts w:ascii="Calibri" w:hAnsi="Calibri" w:eastAsia="" w:cs="" w:asciiTheme="majorHAnsi" w:cstheme="majorBidi" w:eastAsiaTheme="majorEastAsia" w:hAnsiTheme="majorHAnsi"/>
+      <w:rFonts w:asciiTheme="majorHAnsi" w:eastAsiaTheme="majorEastAsia" w:hAnsiTheme="majorHAnsi" w:cstheme="majorBidi"/>
       <w:color w:val="4F81BD" w:themeColor="accent1"/>
-      <w:sz w:val="24"/>
-      <w:szCs w:val="24"/>
     </w:rPr>
   </w:style>
   <w:style w:type="paragraph" w:styleId="Heading8">
-    <w:name w:val="Heading 8"/>
+    <w:name w:val="heading 8"/>
     <w:basedOn w:val="Normal"/>
     <w:uiPriority w:val="9"/>
     <w:unhideWhenUsed/>
     <w:qFormat/>
     <w:pPr>
-      <w:keepNext w:val="true"/>
+      <w:keepNext/>
       <w:keepLines/>
       <w:spacing w:before="200" w:after="0"/>
       <w:outlineLvl w:val="7"/>
     </w:pPr>
     <w:rPr>
-      <w:rFonts w:ascii="Calibri" w:hAnsi="Calibri" w:eastAsia="" w:cs="" w:asciiTheme="majorHAnsi" w:cstheme="majorBidi" w:eastAsiaTheme="majorEastAsia" w:hAnsiTheme="majorHAnsi"/>
+      <w:rFonts w:asciiTheme="majorHAnsi" w:eastAsiaTheme="majorEastAsia" w:hAnsiTheme="majorHAnsi" w:cstheme="majorBidi"/>
       <w:color w:val="4F81BD" w:themeColor="accent1"/>
-      <w:sz w:val="24"/>
-      <w:szCs w:val="24"/>
     </w:rPr>
   </w:style>
   <w:style w:type="paragraph" w:styleId="Heading9">
-    <w:name w:val="Heading 9"/>
+    <w:name w:val="heading 9"/>
     <w:basedOn w:val="Normal"/>
     <w:uiPriority w:val="9"/>
     <w:unhideWhenUsed/>
     <w:qFormat/>
     <w:pPr>
-      <w:keepNext w:val="true"/>
+      <w:keepNext/>
       <w:keepLines/>
       <w:spacing w:before="200" w:after="0"/>
       <w:outlineLvl w:val="8"/>
     </w:pPr>
     <w:rPr>
-      <w:rFonts w:ascii="Calibri" w:hAnsi="Calibri" w:eastAsia="" w:cs="" w:asciiTheme="majorHAnsi" w:cstheme="majorBidi" w:eastAsiaTheme="majorEastAsia" w:hAnsiTheme="majorHAnsi"/>
+      <w:rFonts w:asciiTheme="majorHAnsi" w:eastAsiaTheme="majorEastAsia" w:hAnsiTheme="majorHAnsi" w:cstheme="majorBidi"/>
       <w:color w:val="4F81BD" w:themeColor="accent1"/>
-      <w:sz w:val="24"/>
-      <w:szCs w:val="24"/>
-    </w:rPr>
-  </w:style>
-  <w:style w:type="character" w:styleId="DefaultParagraphFont" w:default="1">
+    </w:rPr>
+  </w:style>
+  <w:style w:type="character" w:default="1" w:styleId="DefaultParagraphFont">
     <w:name w:val="Default Paragraph Font"/>
+    <w:uiPriority w:val="1"/>
     <w:semiHidden/>
     <w:unhideWhenUsed/>
-    <w:qFormat/>
-    <w:rPr/>
-  </w:style>
-  <w:style w:type="character" w:styleId="BodyTextChar" w:customStyle="1">
-    <w:name w:val="Body Text Char"/>
+  </w:style>
+  <w:style w:type="table" w:default="1" w:styleId="TableNormal">
+    <w:name w:val="Normal Table"/>
+    <w:uiPriority w:val="99"/>
+    <w:semiHidden/>
+    <w:unhideWhenUsed/>
+    <w:tblPr>
+      <w:tblInd w:w="0" w:type="dxa"/>
+      <w:tblCellMar>
+        <w:top w:w="0" w:type="dxa"/>
+        <w:left w:w="108" w:type="dxa"/>
+        <w:bottom w:w="0" w:type="dxa"/>
+        <w:right w:w="108" w:type="dxa"/>
+      </w:tblCellMar>
+    </w:tblPr>
+  </w:style>
+  <w:style w:type="numbering" w:default="1" w:styleId="NoList">
+    <w:name w:val="No List"/>
+    <w:uiPriority w:val="99"/>
+    <w:semiHidden/>
+    <w:unhideWhenUsed/>
+  </w:style>
+  <w:style w:type="character" w:customStyle="1" w:styleId="CaptionChar">
+    <w:name w:val="Caption Char"/>
     <w:basedOn w:val="DefaultParagraphFont"/>
-    <w:qFormat/>
-    <w:rPr/>
-  </w:style>
-  <w:style w:type="character" w:styleId="VerbatimChar" w:customStyle="1">
+    <w:link w:val="Caption"/>
+    <w:qFormat/>
+  </w:style>
+  <w:style w:type="character" w:customStyle="1" w:styleId="VerbatimChar">
     <w:name w:val="Verbatim Char"/>
-    <w:basedOn w:val="BodyTextChar"/>
-    <w:qFormat/>
-    <w:rPr>
-      <w:rFonts w:ascii="Consolas" w:hAnsi="Consolas"/>
-      <w:sz w:val="22"/>
-    </w:rPr>
-  </w:style>
-  <w:style w:type="character" w:styleId="FootnoteCharacters">
+    <w:basedOn w:val="CaptionChar"/>
+    <w:link w:val="SourceCode"/>
+    <w:qFormat/>
+    <w:rPr>
+      <w:rFonts w:ascii="Consolas" w:hAnsi="Consolas"/>
+      <w:sz w:val="22"/>
+    </w:rPr>
+  </w:style>
+  <w:style w:type="character" w:customStyle="1" w:styleId="FootnoteCharacters">
     <w:name w:val="Footnote Characters"/>
     <w:qFormat/>
     <w:rPr>
       <w:vertAlign w:val="superscript"/>
     </w:rPr>
   </w:style>
-  <w:style w:type="character" w:styleId="FootnoteAnchor">
-    <w:name w:val="Footnote Reference"/>
+  <w:style w:type="character" w:styleId="FootnoteReference">
+    <w:name w:val="footnote reference"/>
     <w:rPr>
       <w:vertAlign w:val="superscript"/>
     </w:rPr>
   </w:style>
-  <w:style w:type="character" w:styleId="InternetLink">
+  <w:style w:type="character" w:styleId="Hyperlink">
     <w:name w:val="Hyperlink"/>
-    <w:basedOn w:val="BodyTextChar"/>
+    <w:basedOn w:val="CaptionChar"/>
     <w:rPr>
       <w:color w:val="4F81BD" w:themeColor="accent1"/>
     </w:rPr>
   </w:style>
-  <w:style w:type="character" w:styleId="KeywordTok" w:customStyle="1">
+  <w:style w:type="character" w:customStyle="1" w:styleId="KeywordTok">
     <w:name w:val="KeywordTok"/>
     <w:basedOn w:val="VerbatimChar"/>
     <w:qFormat/>
     <w:rPr>
+      <w:rFonts w:ascii="Consolas" w:hAnsi="Consolas"/>
       <w:b/>
       <w:color w:val="007020"/>
-    </w:rPr>
-  </w:style>
-  <w:style w:type="character" w:styleId="DataTypeTok" w:customStyle="1">
+      <w:sz w:val="22"/>
+    </w:rPr>
+  </w:style>
+  <w:style w:type="character" w:customStyle="1" w:styleId="DataTypeTok">
     <w:name w:val="DataTypeTok"/>
     <w:basedOn w:val="VerbatimChar"/>
     <w:qFormat/>
     <w:rPr>
+      <w:rFonts w:ascii="Consolas" w:hAnsi="Consolas"/>
       <w:color w:val="902000"/>
-    </w:rPr>
-  </w:style>
-  <w:style w:type="character" w:styleId="DecValTok" w:customStyle="1">
+      <w:sz w:val="22"/>
+    </w:rPr>
+  </w:style>
+  <w:style w:type="character" w:customStyle="1" w:styleId="DecValTok">
     <w:name w:val="DecValTok"/>
     <w:basedOn w:val="VerbatimChar"/>
     <w:qFormat/>
     <w:rPr>
+      <w:rFonts w:ascii="Consolas" w:hAnsi="Consolas"/>
       <w:color w:val="40A070"/>
-    </w:rPr>
-  </w:style>
-  <w:style w:type="character" w:styleId="BaseNTok" w:customStyle="1">
+      <w:sz w:val="22"/>
+    </w:rPr>
+  </w:style>
+  <w:style w:type="character" w:customStyle="1" w:styleId="BaseNTok">
     <w:name w:val="BaseNTok"/>
     <w:basedOn w:val="VerbatimChar"/>
     <w:qFormat/>
     <w:rPr>
+      <w:rFonts w:ascii="Consolas" w:hAnsi="Consolas"/>
       <w:color w:val="40A070"/>
-    </w:rPr>
-  </w:style>
-  <w:style w:type="character" w:styleId="FloatTok" w:customStyle="1">
+      <w:sz w:val="22"/>
+    </w:rPr>
+  </w:style>
+  <w:style w:type="character" w:customStyle="1" w:styleId="FloatTok">
     <w:name w:val="FloatTok"/>
     <w:basedOn w:val="VerbatimChar"/>
     <w:qFormat/>
     <w:rPr>
+      <w:rFonts w:ascii="Consolas" w:hAnsi="Consolas"/>
       <w:color w:val="40A070"/>
-    </w:rPr>
-  </w:style>
-  <w:style w:type="character" w:styleId="ConstantTok" w:customStyle="1">
+      <w:sz w:val="22"/>
+    </w:rPr>
+  </w:style>
+  <w:style w:type="character" w:customStyle="1" w:styleId="ConstantTok">
     <w:name w:val="ConstantTok"/>
     <w:basedOn w:val="VerbatimChar"/>
     <w:qFormat/>
     <w:rPr>
+      <w:rFonts w:ascii="Consolas" w:hAnsi="Consolas"/>
       <w:color w:val="880000"/>
-    </w:rPr>
-  </w:style>
-  <w:style w:type="character" w:styleId="CharTok" w:customStyle="1">
+      <w:sz w:val="22"/>
+    </w:rPr>
+  </w:style>
+  <w:style w:type="character" w:customStyle="1" w:styleId="CharTok">
     <w:name w:val="CharTok"/>
     <w:basedOn w:val="VerbatimChar"/>
     <w:qFormat/>
     <w:rPr>
+      <w:rFonts w:ascii="Consolas" w:hAnsi="Consolas"/>
       <w:color w:val="4070A0"/>
-    </w:rPr>
-  </w:style>
-  <w:style w:type="character" w:styleId="SpecialCharTok" w:customStyle="1">
+      <w:sz w:val="22"/>
+    </w:rPr>
+  </w:style>
+  <w:style w:type="character" w:customStyle="1" w:styleId="SpecialCharTok">
     <w:name w:val="SpecialCharTok"/>
     <w:basedOn w:val="VerbatimChar"/>
     <w:qFormat/>
     <w:rPr>
+      <w:rFonts w:ascii="Consolas" w:hAnsi="Consolas"/>
       <w:color w:val="4070A0"/>
-    </w:rPr>
-  </w:style>
-  <w:style w:type="character" w:styleId="StringTok" w:customStyle="1">
+      <w:sz w:val="22"/>
+    </w:rPr>
+  </w:style>
+  <w:style w:type="character" w:customStyle="1" w:styleId="StringTok">
     <w:name w:val="StringTok"/>
     <w:basedOn w:val="VerbatimChar"/>
     <w:qFormat/>
     <w:rPr>
+      <w:rFonts w:ascii="Consolas" w:hAnsi="Consolas"/>
       <w:color w:val="4070A0"/>
-    </w:rPr>
-  </w:style>
-  <w:style w:type="character" w:styleId="VerbatimStringTok" w:customStyle="1">
+      <w:sz w:val="22"/>
+    </w:rPr>
+  </w:style>
+  <w:style w:type="character" w:customStyle="1" w:styleId="VerbatimStringTok">
     <w:name w:val="VerbatimStringTok"/>
     <w:basedOn w:val="VerbatimChar"/>
     <w:qFormat/>
     <w:rPr>
+      <w:rFonts w:ascii="Consolas" w:hAnsi="Consolas"/>
       <w:color w:val="4070A0"/>
-    </w:rPr>
-  </w:style>
-  <w:style w:type="character" w:styleId="SpecialStringTok" w:customStyle="1">
+      <w:sz w:val="22"/>
+    </w:rPr>
+  </w:style>
+  <w:style w:type="character" w:customStyle="1" w:styleId="SpecialStringTok">
     <w:name w:val="SpecialStringTok"/>
     <w:basedOn w:val="VerbatimChar"/>
     <w:qFormat/>
     <w:rPr>
+      <w:rFonts w:ascii="Consolas" w:hAnsi="Consolas"/>
       <w:color w:val="BB6688"/>
-    </w:rPr>
-  </w:style>
-  <w:style w:type="character" w:styleId="ImportTok" w:customStyle="1">
+      <w:sz w:val="22"/>
+    </w:rPr>
+  </w:style>
+  <w:style w:type="character" w:customStyle="1" w:styleId="ImportTok">
     <w:name w:val="ImportTok"/>
     <w:basedOn w:val="VerbatimChar"/>
     <w:qFormat/>
-    <w:rPr/>
-  </w:style>
-  <w:style w:type="character" w:styleId="CommentTok" w:customStyle="1">
+    <w:rPr>
+      <w:rFonts w:ascii="Consolas" w:hAnsi="Consolas"/>
+      <w:sz w:val="22"/>
+    </w:rPr>
+  </w:style>
+  <w:style w:type="character" w:customStyle="1" w:styleId="CommentTok">
     <w:name w:val="CommentTok"/>
     <w:basedOn w:val="VerbatimChar"/>
     <w:qFormat/>
     <w:rPr>
+      <w:rFonts w:ascii="Consolas" w:hAnsi="Consolas"/>
       <w:i/>
       <w:color w:val="60A0B0"/>
-    </w:rPr>
-  </w:style>
-  <w:style w:type="character" w:styleId="DocumentationTok" w:customStyle="1">
+      <w:sz w:val="22"/>
+    </w:rPr>
+  </w:style>
+  <w:style w:type="character" w:customStyle="1" w:styleId="DocumentationTok">
     <w:name w:val="DocumentationTok"/>
     <w:basedOn w:val="VerbatimChar"/>
     <w:qFormat/>
     <w:rPr>
+      <w:rFonts w:ascii="Consolas" w:hAnsi="Consolas"/>
       <w:i/>
       <w:color w:val="BA2121"/>
-    </w:rPr>
-  </w:style>
-  <w:style w:type="character" w:styleId="AnnotationTok" w:customStyle="1">
+      <w:sz w:val="22"/>
+    </w:rPr>
+  </w:style>
+  <w:style w:type="character" w:customStyle="1" w:styleId="AnnotationTok">
     <w:name w:val="AnnotationTok"/>
     <w:basedOn w:val="VerbatimChar"/>
     <w:qFormat/>
     <w:rPr>
+      <w:rFonts w:ascii="Consolas" w:hAnsi="Consolas"/>
       <w:b/>
       <w:i/>
       <w:color w:val="60A0B0"/>
-    </w:rPr>
-  </w:style>
-  <w:style w:type="character" w:styleId="CommentVarTok" w:customStyle="1">
+      <w:sz w:val="22"/>
+    </w:rPr>
+  </w:style>
+  <w:style w:type="character" w:customStyle="1" w:styleId="CommentVarTok">
     <w:name w:val="CommentVarTok"/>
     <w:basedOn w:val="VerbatimChar"/>
     <w:qFormat/>
     <w:rPr>
+      <w:rFonts w:ascii="Consolas" w:hAnsi="Consolas"/>
       <w:b/>
       <w:i/>
       <w:color w:val="60A0B0"/>
-    </w:rPr>
-  </w:style>
-  <w:style w:type="character" w:styleId="OtherTok" w:customStyle="1">
+      <w:sz w:val="22"/>
+    </w:rPr>
+  </w:style>
+  <w:style w:type="character" w:customStyle="1" w:styleId="OtherTok">
     <w:name w:val="OtherTok"/>
     <w:basedOn w:val="VerbatimChar"/>
     <w:qFormat/>
     <w:rPr>
+      <w:rFonts w:ascii="Consolas" w:hAnsi="Consolas"/>
       <w:color w:val="007020"/>
-    </w:rPr>
-  </w:style>
-  <w:style w:type="character" w:styleId="FunctionTok" w:customStyle="1">
+      <w:sz w:val="22"/>
+    </w:rPr>
+  </w:style>
+  <w:style w:type="character" w:customStyle="1" w:styleId="FunctionTok">
     <w:name w:val="FunctionTok"/>
     <w:basedOn w:val="VerbatimChar"/>
     <w:qFormat/>
     <w:rPr>
+      <w:rFonts w:ascii="Consolas" w:hAnsi="Consolas"/>
       <w:color w:val="06287E"/>
-    </w:rPr>
-  </w:style>
-  <w:style w:type="character" w:styleId="VariableTok" w:customStyle="1">
+      <w:sz w:val="22"/>
+    </w:rPr>
+  </w:style>
+  <w:style w:type="character" w:customStyle="1" w:styleId="VariableTok">
     <w:name w:val="VariableTok"/>
     <w:basedOn w:val="VerbatimChar"/>
     <w:qFormat/>
     <w:rPr>
+      <w:rFonts w:ascii="Consolas" w:hAnsi="Consolas"/>
       <w:color w:val="19177C"/>
-    </w:rPr>
-  </w:style>
-  <w:style w:type="character" w:styleId="ControlFlowTok" w:customStyle="1">
+      <w:sz w:val="22"/>
+    </w:rPr>
+  </w:style>
+  <w:style w:type="character" w:customStyle="1" w:styleId="ControlFlowTok">
     <w:name w:val="ControlFlowTok"/>
     <w:basedOn w:val="VerbatimChar"/>
     <w:qFormat/>
     <w:rPr>
+      <w:rFonts w:ascii="Consolas" w:hAnsi="Consolas"/>
       <w:b/>
       <w:color w:val="007020"/>
-    </w:rPr>
-  </w:style>
-  <w:style w:type="character" w:styleId="OperatorTok" w:customStyle="1">
+      <w:sz w:val="22"/>
+    </w:rPr>
+  </w:style>
+  <w:style w:type="character" w:customStyle="1" w:styleId="OperatorTok">
     <w:name w:val="OperatorTok"/>
     <w:basedOn w:val="VerbatimChar"/>
     <w:qFormat/>
     <w:rPr>
+      <w:rFonts w:ascii="Consolas" w:hAnsi="Consolas"/>
       <w:color w:val="666666"/>
-    </w:rPr>
-  </w:style>
-  <w:style w:type="character" w:styleId="BuiltInTok" w:customStyle="1">
+      <w:sz w:val="22"/>
+    </w:rPr>
+  </w:style>
+  <w:style w:type="character" w:customStyle="1" w:styleId="BuiltInTok">
     <w:name w:val="BuiltInTok"/>
     <w:basedOn w:val="VerbatimChar"/>
     <w:qFormat/>
-    <w:rPr/>
-  </w:style>
-  <w:style w:type="character" w:styleId="ExtensionTok" w:customStyle="1">
+    <w:rPr>
+      <w:rFonts w:ascii="Consolas" w:hAnsi="Consolas"/>
+      <w:sz w:val="22"/>
+    </w:rPr>
+  </w:style>
+  <w:style w:type="character" w:customStyle="1" w:styleId="ExtensionTok">
     <w:name w:val="ExtensionTok"/>
     <w:basedOn w:val="VerbatimChar"/>
     <w:qFormat/>
-    <w:rPr/>
-  </w:style>
-  <w:style w:type="character" w:styleId="PreprocessorTok" w:customStyle="1">
+    <w:rPr>
+      <w:rFonts w:ascii="Consolas" w:hAnsi="Consolas"/>
+      <w:sz w:val="22"/>
+    </w:rPr>
+  </w:style>
+  <w:style w:type="character" w:customStyle="1" w:styleId="PreprocessorTok">
     <w:name w:val="PreprocessorTok"/>
     <w:basedOn w:val="VerbatimChar"/>
     <w:qFormat/>
     <w:rPr>
+      <w:rFonts w:ascii="Consolas" w:hAnsi="Consolas"/>
       <w:color w:val="BC7A00"/>
-    </w:rPr>
-  </w:style>
-  <w:style w:type="character" w:styleId="AttributeTok" w:customStyle="1">
+      <w:sz w:val="22"/>
+    </w:rPr>
+  </w:style>
+  <w:style w:type="character" w:customStyle="1" w:styleId="AttributeTok">
     <w:name w:val="AttributeTok"/>
     <w:basedOn w:val="VerbatimChar"/>
     <w:qFormat/>
     <w:rPr>
+      <w:rFonts w:ascii="Consolas" w:hAnsi="Consolas"/>
       <w:color w:val="7D9029"/>
-    </w:rPr>
-  </w:style>
-  <w:style w:type="character" w:styleId="RegionMarkerTok" w:customStyle="1">
+      <w:sz w:val="22"/>
+    </w:rPr>
+  </w:style>
+  <w:style w:type="character" w:customStyle="1" w:styleId="RegionMarkerTok">
     <w:name w:val="RegionMarkerTok"/>
     <w:basedOn w:val="VerbatimChar"/>
     <w:qFormat/>
-    <w:rPr/>
-  </w:style>
-  <w:style w:type="character" w:styleId="InformationTok" w:customStyle="1">
+    <w:rPr>
+      <w:rFonts w:ascii="Consolas" w:hAnsi="Consolas"/>
+      <w:sz w:val="22"/>
+    </w:rPr>
+  </w:style>
+  <w:style w:type="character" w:customStyle="1" w:styleId="InformationTok">
     <w:name w:val="InformationTok"/>
     <w:basedOn w:val="VerbatimChar"/>
     <w:qFormat/>
     <w:rPr>
+      <w:rFonts w:ascii="Consolas" w:hAnsi="Consolas"/>
       <w:b/>
       <w:i/>
       <w:color w:val="60A0B0"/>
-    </w:rPr>
-  </w:style>
-  <w:style w:type="character" w:styleId="WarningTok" w:customStyle="1">
+      <w:sz w:val="22"/>
+    </w:rPr>
+  </w:style>
+  <w:style w:type="character" w:customStyle="1" w:styleId="WarningTok">
     <w:name w:val="WarningTok"/>
     <w:basedOn w:val="VerbatimChar"/>
     <w:qFormat/>
     <w:rPr>
+      <w:rFonts w:ascii="Consolas" w:hAnsi="Consolas"/>
       <w:b/>
       <w:i/>
       <w:color w:val="60A0B0"/>
-    </w:rPr>
-  </w:style>
-  <w:style w:type="character" w:styleId="AlertTok" w:customStyle="1">
+      <w:sz w:val="22"/>
+    </w:rPr>
+  </w:style>
+  <w:style w:type="character" w:customStyle="1" w:styleId="AlertTok">
     <w:name w:val="AlertTok"/>
     <w:basedOn w:val="VerbatimChar"/>
     <w:qFormat/>
     <w:rPr>
+      <w:rFonts w:ascii="Consolas" w:hAnsi="Consolas"/>
       <w:b/>
       <w:color w:val="FF0000"/>
-    </w:rPr>
-  </w:style>
-  <w:style w:type="character" w:styleId="ErrorTok" w:customStyle="1">
+      <w:sz w:val="22"/>
+    </w:rPr>
+  </w:style>
+  <w:style w:type="character" w:customStyle="1" w:styleId="ErrorTok">
     <w:name w:val="ErrorTok"/>
     <w:basedOn w:val="VerbatimChar"/>
     <w:qFormat/>
     <w:rPr>
+      <w:rFonts w:ascii="Consolas" w:hAnsi="Consolas"/>
       <w:b/>
       <w:color w:val="FF0000"/>
-    </w:rPr>
-  </w:style>
-  <w:style w:type="character" w:styleId="NormalTok" w:customStyle="1">
+      <w:sz w:val="22"/>
+    </w:rPr>
+  </w:style>
+  <w:style w:type="character" w:customStyle="1" w:styleId="NormalTok">
     <w:name w:val="NormalTok"/>
     <w:basedOn w:val="VerbatimChar"/>
     <w:qFormat/>
-    <w:rPr/>
-  </w:style>
-  <w:style w:type="character" w:styleId="LineNumbering">
-    <w:name w:val="Line Number"/>
-    <w:rPr/>
+    <w:rPr>
+      <w:rFonts w:ascii="Consolas" w:hAnsi="Consolas"/>
+      <w:sz w:val="22"/>
+    </w:rPr>
+  </w:style>
+  <w:style w:type="character" w:styleId="LineNumber">
+    <w:name w:val="line number"/>
   </w:style>
   <w:style w:type="character" w:styleId="Emphasis">
     <w:name w:val="Emphasis"/>
@@ -547,54 +851,52 @@
       <w:iCs/>
     </w:rPr>
   </w:style>
-  <w:style w:type="paragraph" w:styleId="Heading">
+  <w:style w:type="paragraph" w:customStyle="1" w:styleId="Heading">
     <w:name w:val="Heading"/>
     <w:basedOn w:val="Normal"/>
-    <w:next w:val="TextBody"/>
-    <w:qFormat/>
-    <w:pPr>
-      <w:keepNext w:val="true"/>
+    <w:next w:val="BodyText"/>
+    <w:qFormat/>
+    <w:pPr>
+      <w:keepNext/>
       <w:spacing w:before="240" w:after="120"/>
     </w:pPr>
     <w:rPr>
-      <w:rFonts w:ascii="Times" w:hAnsi="Times" w:eastAsia="Droid Sans Fallback" w:cs="Droid Sans Devanagari"/>
+      <w:rFonts w:eastAsia="Droid Sans Fallback" w:cs="Droid Sans Devanagari"/>
       <w:sz w:val="28"/>
       <w:szCs w:val="28"/>
     </w:rPr>
   </w:style>
-  <w:style w:type="paragraph" w:styleId="TextBody">
+  <w:style w:type="paragraph" w:styleId="BodyText">
     <w:name w:val="Body Text"/>
     <w:basedOn w:val="Normal"/>
-    <w:link w:val="BodyTextChar"/>
-    <w:qFormat/>
-    <w:pPr>
-      <w:spacing w:lineRule="auto" w:line="480" w:before="0" w:after="0"/>
-      <w:ind w:left="0" w:right="0" w:firstLine="576"/>
+    <w:qFormat/>
+    <w:rsid w:val="00B57B30"/>
+    <w:pPr>
+      <w:spacing w:after="0"/>
+      <w:ind w:firstLine="576"/>
       <w:contextualSpacing/>
     </w:pPr>
-    <w:rPr/>
   </w:style>
   <w:style w:type="paragraph" w:styleId="List">
     <w:name w:val="List"/>
-    <w:basedOn w:val="TextBody"/>
-    <w:pPr/>
+    <w:basedOn w:val="BodyText"/>
     <w:rPr>
       <w:rFonts w:cs="Droid Sans Devanagari"/>
     </w:rPr>
   </w:style>
   <w:style w:type="paragraph" w:styleId="Caption">
-    <w:name w:val="Caption"/>
-    <w:basedOn w:val="Normal"/>
-    <w:link w:val="BodyTextChar"/>
-    <w:qFormat/>
-    <w:pPr>
-      <w:spacing w:before="0" w:after="120"/>
+    <w:name w:val="caption"/>
+    <w:basedOn w:val="Normal"/>
+    <w:link w:val="CaptionChar"/>
+    <w:qFormat/>
+    <w:pPr>
+      <w:spacing w:after="120"/>
     </w:pPr>
     <w:rPr>
       <w:i/>
     </w:rPr>
   </w:style>
-  <w:style w:type="paragraph" w:styleId="Index">
+  <w:style w:type="paragraph" w:customStyle="1" w:styleId="Index">
     <w:name w:val="Index"/>
     <w:basedOn w:val="Normal"/>
     <w:qFormat/>
@@ -605,44 +907,35 @@
       <w:rFonts w:cs="Droid Sans Devanagari"/>
     </w:rPr>
   </w:style>
-  <w:style w:type="paragraph" w:styleId="FirstParagraph" w:customStyle="1">
+  <w:style w:type="paragraph" w:customStyle="1" w:styleId="FirstParagraph">
     <w:name w:val="First Paragraph"/>
-    <w:basedOn w:val="TextBody"/>
-    <w:qFormat/>
-    <w:pPr>
-      <w:spacing w:lineRule="auto" w:line="480" w:before="187" w:after="0"/>
-      <w:ind w:left="0" w:right="0" w:hanging="0"/>
-      <w:contextualSpacing/>
-    </w:pPr>
-    <w:rPr>
-      <w:rFonts w:ascii="Times" w:hAnsi="Times"/>
-    </w:rPr>
-  </w:style>
-  <w:style w:type="paragraph" w:styleId="Compact" w:customStyle="1">
+    <w:basedOn w:val="BodyText"/>
+    <w:qFormat/>
+    <w:pPr>
+      <w:spacing w:before="187"/>
+    </w:pPr>
+  </w:style>
+  <w:style w:type="paragraph" w:customStyle="1" w:styleId="Compact">
     <w:name w:val="Compact"/>
-    <w:basedOn w:val="TextBody"/>
+    <w:basedOn w:val="BodyText"/>
     <w:qFormat/>
     <w:pPr>
       <w:spacing w:before="36" w:after="36"/>
-      <w:contextualSpacing/>
-    </w:pPr>
-    <w:rPr/>
+    </w:pPr>
   </w:style>
   <w:style w:type="paragraph" w:styleId="Title">
     <w:name w:val="Title"/>
     <w:basedOn w:val="Normal"/>
     <w:qFormat/>
     <w:pPr>
-      <w:keepNext w:val="true"/>
+      <w:keepNext/>
       <w:keepLines/>
       <w:spacing w:before="480" w:after="240"/>
-      <w:jc w:val="left"/>
-    </w:pPr>
-    <w:rPr>
-      <w:rFonts w:ascii="Times" w:hAnsi="Times" w:eastAsia="" w:cs="" w:cstheme="majorBidi" w:eastAsiaTheme="majorEastAsia"/>
+    </w:pPr>
+    <w:rPr>
+      <w:rFonts w:eastAsiaTheme="majorEastAsia" w:cstheme="majorBidi"/>
       <w:b/>
       <w:bCs/>
-      <w:color w:val="auto" w:themeShade="b5"/>
       <w:sz w:val="36"/>
       <w:szCs w:val="36"/>
     </w:rPr>
@@ -652,9 +945,7 @@
     <w:basedOn w:val="Title"/>
     <w:qFormat/>
     <w:pPr>
-      <w:keepNext w:val="true"/>
-      <w:keepLines/>
-      <w:spacing w:before="240" w:after="240"/>
+      <w:spacing w:before="240"/>
       <w:jc w:val="center"/>
     </w:pPr>
     <w:rPr>
@@ -662,54 +953,36 @@
       <w:szCs w:val="30"/>
     </w:rPr>
   </w:style>
-  <w:style w:type="paragraph" w:styleId="Author" w:customStyle="1">
+  <w:style w:type="paragraph" w:customStyle="1" w:styleId="Author">
     <w:name w:val="Author"/>
     <w:qFormat/>
     <w:pPr>
-      <w:keepNext w:val="true"/>
+      <w:keepNext/>
       <w:keepLines/>
-      <w:widowControl/>
-      <w:suppressAutoHyphens w:val="true"/>
-      <w:bidi w:val="0"/>
-      <w:spacing w:before="0" w:after="200"/>
-      <w:jc w:val="left"/>
-    </w:pPr>
-    <w:rPr>
-      <w:rFonts w:ascii="Cambria" w:hAnsi="Cambria" w:eastAsia="Cambria" w:cs="" w:asciiTheme="minorHAnsi" w:cstheme="minorBidi" w:eastAsiaTheme="minorHAnsi" w:hAnsiTheme="minorHAnsi"/>
-      <w:color w:val="auto"/>
-      <w:kern w:val="0"/>
+      <w:spacing w:after="200"/>
+    </w:pPr>
+    <w:rPr>
       <w:sz w:val="24"/>
-      <w:szCs w:val="24"/>
-      <w:lang w:val="en-US" w:eastAsia="en-US" w:bidi="ar-SA"/>
     </w:rPr>
   </w:style>
   <w:style w:type="paragraph" w:styleId="Date">
     <w:name w:val="Date"/>
     <w:qFormat/>
     <w:pPr>
-      <w:keepNext w:val="true"/>
+      <w:keepNext/>
       <w:keepLines/>
-      <w:widowControl/>
-      <w:suppressAutoHyphens w:val="true"/>
-      <w:bidi w:val="0"/>
-      <w:spacing w:before="0" w:after="200"/>
-      <w:jc w:val="left"/>
-    </w:pPr>
-    <w:rPr>
-      <w:rFonts w:ascii="Cambria" w:hAnsi="Cambria" w:eastAsia="Cambria" w:cs="" w:asciiTheme="minorHAnsi" w:cstheme="minorBidi" w:eastAsiaTheme="minorHAnsi" w:hAnsiTheme="minorHAnsi"/>
-      <w:color w:val="auto"/>
-      <w:kern w:val="0"/>
+      <w:spacing w:after="200"/>
+    </w:pPr>
+    <w:rPr>
       <w:sz w:val="24"/>
-      <w:szCs w:val="24"/>
-      <w:lang w:val="en-US" w:eastAsia="en-US" w:bidi="ar-SA"/>
-    </w:rPr>
-  </w:style>
-  <w:style w:type="paragraph" w:styleId="Abstract" w:customStyle="1">
+    </w:rPr>
+  </w:style>
+  <w:style w:type="paragraph" w:customStyle="1" w:styleId="Abstract">
     <w:name w:val="Abstract"/>
     <w:basedOn w:val="Normal"/>
     <w:qFormat/>
     <w:pPr>
-      <w:keepNext w:val="true"/>
+      <w:keepNext/>
       <w:keepLines/>
       <w:spacing w:before="300" w:after="300"/>
     </w:pPr>
@@ -722,167 +995,132 @@
     <w:name w:val="Bibliography"/>
     <w:basedOn w:val="Normal"/>
     <w:qFormat/>
-    <w:pPr/>
-    <w:rPr/>
   </w:style>
   <w:style w:type="paragraph" w:styleId="BlockText">
     <w:name w:val="Block Text"/>
-    <w:basedOn w:val="TextBody"/>
+    <w:basedOn w:val="BodyText"/>
     <w:uiPriority w:val="9"/>
     <w:unhideWhenUsed/>
     <w:qFormat/>
     <w:pPr>
       <w:spacing w:before="100" w:after="100"/>
-      <w:ind w:left="0" w:right="0" w:hanging="0"/>
-      <w:contextualSpacing/>
-    </w:pPr>
-    <w:rPr>
-      <w:rFonts w:ascii="Calibri" w:hAnsi="Calibri" w:eastAsia="" w:cs="" w:asciiTheme="majorHAnsi" w:cstheme="majorBidi" w:eastAsiaTheme="majorEastAsia" w:hAnsiTheme="majorHAnsi"/>
+    </w:pPr>
+    <w:rPr>
+      <w:rFonts w:asciiTheme="majorHAnsi" w:eastAsiaTheme="majorEastAsia" w:hAnsiTheme="majorHAnsi" w:cstheme="majorBidi"/>
       <w:bCs/>
       <w:sz w:val="20"/>
       <w:szCs w:val="20"/>
     </w:rPr>
   </w:style>
-  <w:style w:type="paragraph" w:styleId="Footnote">
-    <w:name w:val="Footnote Text"/>
+  <w:style w:type="paragraph" w:styleId="FootnoteText">
+    <w:name w:val="footnote text"/>
     <w:basedOn w:val="Normal"/>
     <w:uiPriority w:val="9"/>
     <w:unhideWhenUsed/>
     <w:qFormat/>
-    <w:pPr/>
-    <w:rPr/>
-  </w:style>
-  <w:style w:type="paragraph" w:styleId="DefinitionTerm" w:customStyle="1">
+  </w:style>
+  <w:style w:type="paragraph" w:customStyle="1" w:styleId="DefinitionTerm">
     <w:name w:val="Definition Term"/>
     <w:basedOn w:val="Normal"/>
     <w:qFormat/>
     <w:pPr>
-      <w:keepNext w:val="true"/>
+      <w:keepNext/>
       <w:keepLines/>
-      <w:spacing w:before="0" w:after="0"/>
+      <w:spacing w:after="0"/>
     </w:pPr>
     <w:rPr>
       <w:b/>
     </w:rPr>
   </w:style>
-  <w:style w:type="paragraph" w:styleId="Definition" w:customStyle="1">
+  <w:style w:type="paragraph" w:customStyle="1" w:styleId="Definition">
     <w:name w:val="Definition"/>
     <w:basedOn w:val="Normal"/>
     <w:qFormat/>
-    <w:pPr/>
-    <w:rPr/>
-  </w:style>
-  <w:style w:type="paragraph" w:styleId="TableCaption" w:customStyle="1">
+  </w:style>
+  <w:style w:type="paragraph" w:customStyle="1" w:styleId="TableCaption">
     <w:name w:val="Table Caption"/>
     <w:basedOn w:val="Caption"/>
     <w:qFormat/>
     <w:pPr>
-      <w:keepNext w:val="true"/>
-    </w:pPr>
-    <w:rPr/>
-  </w:style>
-  <w:style w:type="paragraph" w:styleId="ImageCaption" w:customStyle="1">
+      <w:keepNext/>
+    </w:pPr>
+  </w:style>
+  <w:style w:type="paragraph" w:customStyle="1" w:styleId="ImageCaption">
     <w:name w:val="Image Caption"/>
     <w:basedOn w:val="Caption"/>
     <w:qFormat/>
-    <w:pPr/>
-    <w:rPr/>
-  </w:style>
-  <w:style w:type="paragraph" w:styleId="Figure" w:customStyle="1">
+  </w:style>
+  <w:style w:type="paragraph" w:customStyle="1" w:styleId="Figure">
     <w:name w:val="Figure"/>
     <w:basedOn w:val="Normal"/>
     <w:qFormat/>
-    <w:pPr/>
-    <w:rPr/>
-  </w:style>
-  <w:style w:type="paragraph" w:styleId="CaptionedFigure" w:customStyle="1">
+  </w:style>
+  <w:style w:type="paragraph" w:customStyle="1" w:styleId="CaptionedFigure">
     <w:name w:val="Captioned Figure"/>
     <w:basedOn w:val="Figure"/>
     <w:qFormat/>
     <w:pPr>
-      <w:keepNext w:val="true"/>
-    </w:pPr>
-    <w:rPr/>
+      <w:keepNext/>
+    </w:pPr>
   </w:style>
   <w:style w:type="paragraph" w:styleId="IndexHeading">
-    <w:name w:val="Index Heading"/>
+    <w:name w:val="index heading"/>
     <w:basedOn w:val="Heading"/>
-    <w:pPr/>
-    <w:rPr/>
-  </w:style>
-  <w:style w:type="paragraph" w:styleId="ContentsHeading">
+  </w:style>
+  <w:style w:type="paragraph" w:styleId="TOCHeading">
     <w:name w:val="TOC Heading"/>
     <w:basedOn w:val="Heading1"/>
     <w:uiPriority w:val="39"/>
     <w:unhideWhenUsed/>
     <w:qFormat/>
     <w:pPr>
-      <w:spacing w:lineRule="auto" w:line="259" w:before="240" w:after="0"/>
-    </w:pPr>
-    <w:rPr>
-      <w:rFonts w:ascii="Calibri" w:hAnsi="Calibri" w:eastAsia="" w:cs="" w:asciiTheme="majorHAnsi" w:cstheme="majorBidi" w:eastAsiaTheme="majorEastAsia" w:hAnsiTheme="majorHAnsi"/>
-      <w:b w:val="false"/>
-      <w:bCs w:val="false"/>
-      <w:color w:val="365F91" w:themeColor="accent1" w:themeShade="bf"/>
-    </w:rPr>
-  </w:style>
-  <w:style w:type="paragraph" w:styleId="SourceCode" w:customStyle="1">
+      <w:spacing w:before="240" w:line="259" w:lineRule="auto"/>
+    </w:pPr>
+    <w:rPr>
+      <w:rFonts w:asciiTheme="majorHAnsi" w:hAnsiTheme="majorHAnsi"/>
+      <w:b w:val="0"/>
+      <w:bCs w:val="0"/>
+      <w:color w:val="365F91" w:themeColor="accent1" w:themeShade="BF"/>
+    </w:rPr>
+  </w:style>
+  <w:style w:type="paragraph" w:customStyle="1" w:styleId="SourceCode">
     <w:name w:val="Source Code"/>
     <w:basedOn w:val="Normal"/>
     <w:link w:val="VerbatimChar"/>
     <w:qFormat/>
-    <w:pPr/>
-    <w:rPr/>
-  </w:style>
-  <w:style w:type="paragraph" w:styleId="HeaderandFooter">
+  </w:style>
+  <w:style w:type="paragraph" w:customStyle="1" w:styleId="HeaderandFooter">
     <w:name w:val="Header and Footer"/>
     <w:basedOn w:val="Normal"/>
     <w:qFormat/>
     <w:pPr>
       <w:suppressLineNumbers/>
       <w:tabs>
-        <w:tab w:val="clear" w:pos="720"/>
-        <w:tab w:val="center" w:pos="4320" w:leader="none"/>
-        <w:tab w:val="right" w:pos="8640" w:leader="none"/>
+        <w:tab w:val="center" w:pos="4320"/>
+        <w:tab w:val="right" w:pos="8640"/>
       </w:tabs>
     </w:pPr>
-    <w:rPr/>
   </w:style>
   <w:style w:type="paragraph" w:styleId="Footer">
-    <w:name w:val="Footer"/>
+    <w:name w:val="footer"/>
     <w:basedOn w:val="HeaderandFooter"/>
-    <w:pPr>
-      <w:suppressLineNumbers/>
-    </w:pPr>
-    <w:rPr/>
   </w:style>
   <w:style w:type="paragraph" w:styleId="Header">
-    <w:name w:val="Header"/>
+    <w:name w:val="header"/>
     <w:basedOn w:val="HeaderandFooter"/>
-    <w:pPr>
-      <w:suppressLineNumbers/>
-    </w:pPr>
-    <w:rPr/>
-  </w:style>
-  <w:style w:type="paragraph" w:styleId="Heading1NoNumber">
+  </w:style>
+  <w:style w:type="paragraph" w:customStyle="1" w:styleId="Heading1NoNumber">
     <w:name w:val="Heading 1 No Number"/>
     <w:basedOn w:val="Heading1"/>
     <w:qFormat/>
-    <w:pPr/>
-    <w:rPr/>
-  </w:style>
-  <w:style w:type="paragraph" w:styleId="TextBodyIndent">
+  </w:style>
+  <w:style w:type="paragraph" w:styleId="BodyTextIndent">
     <w:name w:val="Body Text Indent"/>
-    <w:basedOn w:val="TextBody"/>
-    <w:qFormat/>
-    <w:pPr>
-      <w:ind w:left="0" w:right="0" w:hanging="0"/>
-    </w:pPr>
-    <w:rPr/>
-  </w:style>
-  <w:style w:type="table" w:default="1" w:styleId="Table">
+    <w:basedOn w:val="BodyText"/>
+    <w:qFormat/>
+  </w:style>
+  <w:style w:type="table" w:customStyle="1" w:styleId="Table">
     <w:name w:val="Table"/>
-    <w:basedOn w:val="TableNormal"/>
     <w:semiHidden/>
     <w:unhideWhenUsed/>
     <w:qFormat/>
@@ -894,6 +1132,17 @@
         <w:right w:w="108" w:type="dxa"/>
       </w:tblCellMar>
     </w:tblPr>
+  </w:style>
+  <w:style w:type="paragraph" w:customStyle="1" w:styleId="affiliations">
+    <w:name w:val="affiliations"/>
+    <w:basedOn w:val="FirstParagraph"/>
+    <w:qFormat/>
+    <w:rsid w:val="00AE7961"/>
+    <w:pPr>
+      <w:spacing w:before="120" w:after="120" w:line="240" w:lineRule="auto"/>
+      <w:ind w:firstLine="0"/>
+      <w:contextualSpacing w:val="0"/>
+    </w:pPr>
   </w:style>
 </w:styles>
 </file>

</xml_diff>

<commit_message>
go back to qmd and separate tables and figs in a separte file
</commit_message>
<xml_diff>
--- a/manuscript/reference.docx
+++ b/manuscript/reference.docx
@@ -4,8 +4,7 @@
   <w:body>
     <w:p>
       <w:pPr>
-        <w:pStyle w:val="FirstParagraph"/>
-        <w:spacing w:before="180" w:after="180"/>
+        <w:pStyle w:val="CustomTable"/>
       </w:pPr>
       <w:r>
         <w:t>hello word</w:t>
@@ -1142,6 +1141,15 @@
       <w:spacing w:before="120" w:after="120" w:line="240" w:lineRule="auto"/>
       <w:ind w:firstLine="0"/>
       <w:contextualSpacing w:val="0"/>
+    </w:pPr>
+  </w:style>
+  <w:style w:type="paragraph" w:customStyle="1" w:styleId="CustomTable">
+    <w:name w:val="Custom Table"/>
+    <w:basedOn w:val="Compact"/>
+    <w:qFormat/>
+    <w:rsid w:val="00ED7F51"/>
+    <w:pPr>
+      <w:ind w:firstLine="0"/>
     </w:pPr>
   </w:style>
 </w:styles>

</xml_diff>

<commit_message>
I did it. I got everything in one document.
</commit_message>
<xml_diff>
--- a/manuscript/reference.docx
+++ b/manuscript/reference.docx
@@ -918,9 +918,15 @@
     <w:name w:val="Compact"/>
     <w:basedOn w:val="BodyText"/>
     <w:qFormat/>
-    <w:pPr>
-      <w:spacing w:before="36" w:after="36"/>
-    </w:pPr>
+    <w:rsid w:val="009D5164"/>
+    <w:pPr>
+      <w:spacing w:line="240" w:lineRule="auto"/>
+      <w:ind w:firstLine="0"/>
+    </w:pPr>
+    <w:rPr>
+      <w:rFonts w:ascii="Arial" w:hAnsi="Arial"/>
+      <w:sz w:val="18"/>
+    </w:rPr>
   </w:style>
   <w:style w:type="paragraph" w:styleId="Title">
     <w:name w:val="Title"/>
@@ -1148,9 +1154,6 @@
     <w:basedOn w:val="Compact"/>
     <w:qFormat/>
     <w:rsid w:val="00ED7F51"/>
-    <w:pPr>
-      <w:ind w:firstLine="0"/>
-    </w:pPr>
   </w:style>
 </w:styles>
 </file>

</xml_diff>